<commit_message>
Sprint 5.2: integrar Firebase FCM para push comunitario y al emisor.
Conecta tokens FCM en la app, Edge Functions con FCM v1 y documentación para completar la configuración en Firebase Console.

Co-authored-by: Cursor <cursoragent@cursor.com>
</commit_message>
<xml_diff>
--- a/Documentos/Documento de Diseño del Sistema (SDD) - Proyecto Centinela.docx
+++ b/Documentos/Documento de Diseño del Sistema (SDD) - Proyecto Centinela.docx
@@ -1236,6 +1236,22 @@
       </w:r>
     </w:p>
     <w:p>
+      <w:r>
+        <w:tab/>
+        <w:t>•</w:t>
+        <w:tab/>
+        <w:t>ultima_ubicacion (Point / Geometría Espacial): Última coordenada GPS reportada por el dispositivo. Requerida para el motor de geofencing (consulta de usuarios dentro del radio).</w:t>
+      </w:r>
+    </w:p>
+    <w:p>
+      <w:r>
+        <w:tab/>
+        <w:t>•</w:t>
+        <w:tab/>
+        <w:t>ubicacion_actualizada_en (Timestamp): Momento de la última actualización de ubicación. Permite descartar tokens obsoletos en consultas geoespaciales.</w:t>
+      </w:r>
+    </w:p>
+    <w:p>
       <w:pPr>
         <w:pStyle w:val="Ttulo2"/>
         <w:spacing w:line="360" w:lineRule="auto"/>
@@ -1954,6 +1970,64 @@
       </w:r>
     </w:p>
     <w:p>
+      <w:r>
+        <w:t>Estado del diseño en Figma (Wireframes MVP): Pantallas 1–3 completadas (Home, Emisión, Detalle receptor). Design system base definido (colores, Inter).</w:t>
+      </w:r>
+    </w:p>
+    <w:p>
+      <w:r>
+        <w:t>Pantallas pendientes de diseño (prioridad antes de Sprint 2):</w:t>
+      </w:r>
+    </w:p>
+    <w:p>
+      <w:r>
+        <w:tab/>
+        <w:t>•</w:t>
+        <w:tab/>
+        <w:t>Pantalla 0 — Onboarding y permisos (GPS + notificaciones push).</w:t>
+      </w:r>
+    </w:p>
+    <w:p>
+      <w:r>
+        <w:tab/>
+        <w:t>•</w:t>
+        <w:tab/>
+        <w:t>Pantalla 0b — Login / Registro (Google, Apple, teléfono o email).</w:t>
+      </w:r>
+    </w:p>
+    <w:p>
+      <w:r>
+        <w:tab/>
+        <w:t>•</w:t>
+        <w:tab/>
+        <w:t>Pantalla 3b — Detalle de alerta (vista Emisor): botones Marcar como Resuelto y Reportar falsa alarma.</w:t>
+      </w:r>
+    </w:p>
+    <w:p>
+      <w:r>
+        <w:tab/>
+        <w:t>•</w:t>
+        <w:tab/>
+        <w:t>Pantalla 3c — Confirmación del flujo Lo vi (envío de coordenadas).</w:t>
+      </w:r>
+    </w:p>
+    <w:p>
+      <w:r>
+        <w:tab/>
+        <w:t>•</w:t>
+        <w:tab/>
+        <w:t>Pantalla Web — Deep Link público (alerta activa y caso resuelto con Open Graph).</w:t>
+      </w:r>
+    </w:p>
+    <w:p>
+      <w:r>
+        <w:tab/>
+        <w:t>•</w:t>
+        <w:tab/>
+        <w:t>Pantalla Legal — Términos y condiciones / consentimiento LOPDP.</w:t>
+      </w:r>
+    </w:p>
+    <w:p>
       <w:pPr>
         <w:pStyle w:val="Ttulo2"/>
         <w:spacing w:line="360" w:lineRule="auto"/>
@@ -3125,6 +3199,17 @@
     <w:p>
       <w:r>
         <w:t>Con esto, el mensaje es un dardo: llama a la acción, muestra urgencia real, y técnicamente está blindado para que siempre cargue la foto de manera profesional.</w:t>
+      </w:r>
+    </w:p>
+    <w:p/>
+    <w:p>
+      <w:r>
+        <w:t>Notas de Infraestructura Supabase</w:t>
+      </w:r>
+    </w:p>
+    <w:p>
+      <w:r>
+        <w:t>Centinela debe usar un proyecto Supabase exclusivo, separado del proyecto RECI. Ver sección correspondiente en el documento de requerimientos. El esquema SQL inicial vive en supabase/migrations/ del repositorio del proyecto.</w:t>
       </w:r>
     </w:p>
     <w:p/>

</xml_diff>

<commit_message>
Reorganizar documentación y planificar Sprint 7 identidad visual.
Índice en Documentos/README, guías y sprints en subcarpetas, README raíz resumido, Word actualizados y backlog Sprint 7.

Co-authored-by: Cursor <cursoragent@cursor.com>
</commit_message>
<xml_diff>
--- a/Documentos/Documento de Diseño del Sistema (SDD) - Proyecto Centinela.docx
+++ b/Documentos/Documento de Diseño del Sistema (SDD) - Proyecto Centinela.docx
@@ -1252,6 +1252,22 @@
       </w:r>
     </w:p>
     <w:p>
+      <w:r>
+        <w:tab/>
+        <w:t>•</w:t>
+        <w:tab/>
+        <w:t>ultima_ubicacion (Point / Geometría Espacial): Última coordenada GPS reportada por el dispositivo. Requerida para el motor de geofencing (consulta de usuarios dentro del radio).</w:t>
+      </w:r>
+    </w:p>
+    <w:p>
+      <w:r>
+        <w:tab/>
+        <w:t>•</w:t>
+        <w:tab/>
+        <w:t>ubicacion_actualizada_en (Timestamp): Momento de la última actualización de ubicación. Permite descartar tokens obsoletos en consultas geoespaciales.</w:t>
+      </w:r>
+    </w:p>
+    <w:p>
       <w:pPr>
         <w:pStyle w:val="Ttulo2"/>
         <w:spacing w:line="360" w:lineRule="auto"/>
@@ -1913,6 +1929,11 @@
     </w:p>
     <w:p>
       <w:r>
+        <w:t>Estado del diseño en Figma (Wireframes MVP): Pantallas principales implementadas en Flutter. Sprint 7 planificado: identidad visual (logo, icono, splash) más allá de wireframes funcionales.</w:t>
+      </w:r>
+    </w:p>
+    <w:p>
+      <w:r>
         <w:t>Estado del diseño en Figma (Wireframes MVP): Pantallas 1–3 completadas (Home, Emisión, Detalle receptor). Design system base definido (colores, Inter).</w:t>
       </w:r>
     </w:p>
@@ -3199,6 +3220,17 @@
     <w:p>
       <w:r>
         <w:t>Con esto, el mensaje es un dardo: llama a la acción, muestra urgencia real, y técnicamente está blindado para que siempre cargue la foto de manera profesional.</w:t>
+      </w:r>
+    </w:p>
+    <w:p/>
+    <w:p>
+      <w:r>
+        <w:t>Notas de Infraestructura Supabase</w:t>
+      </w:r>
+    </w:p>
+    <w:p>
+      <w:r>
+        <w:t>Centinela debe usar un proyecto Supabase exclusivo, separado del proyecto RECI. Ver sección correspondiente en el documento de requerimientos. El esquema SQL inicial vive en supabase/migrations/ del repositorio del proyecto.</w:t>
       </w:r>
     </w:p>
     <w:p/>

</xml_diff>